<commit_message>
feat(mockup): Phase 1 — SKU-level capacity reservations + pooled quota groups
Surfaces capacity at SKU grain (CAP-022/023) and quota at VM/quota-family
grain (QUA-002/003/004), joined via GROUP AVAIL = MIN(reserved-free, family
quota-available). Read-only feasibility layer; does not modify v2.4 baseline
or the placement scoring engine (Phase 2).

New sheets: SKU_Family_Map, SKU_Catalogue, Capacity_By_SKU (Region×Env×SKU),
Quota_Groups (Region×Family, pooled across Prod+NonProd+DR per QUA-004),
SKU_Grain_ReadMe.

Rulings applied: one pooled quota group across all envs (QUA-004); hard env
separation for capacity reservations only (ENV-003); quota hoarded to a single
pool, distributed on demand (QUA-003); DR = 30% Prod bootstrap (ENV-005).

Verified with headless recalc: 0 formula errors; VLOOKUP/SUMIFS/MIN resolve.
User guide updated with section 11.
</commit_message>
<xml_diff>
--- a/Mockups/acrme_region_selection_whatif_acrme_regions_user_guide.docx
+++ b/Mockups/acrme_region_selection_whatif_acrme_regions_user_guide.docx
@@ -2,7 +2,7 @@
 <file path=word/document.xml><?xml version="1.0" encoding="utf-8"?>
 <w:document xmlns:w="http://schemas.openxmlformats.org/wordprocessingml/2006/main" xmlns:m="http://schemas.openxmlformats.org/officeDocument/2006/math" xmlns:r="http://schemas.openxmlformats.org/officeDocument/2006/relationships" xmlns:o="urn:schemas-microsoft-com:office:office" xmlns:v="urn:schemas-microsoft-com:vml" xmlns:w10="urn:schemas-microsoft-com:office:word" xmlns:a="http://schemas.openxmlformats.org/drawingml/2006/main" xmlns:pic="http://schemas.openxmlformats.org/drawingml/2006/picture" xmlns:wp="http://schemas.openxmlformats.org/drawingml/2006/wordprocessingDrawing">
   <w:body>
-    <w:bookmarkStart w:id="111" w:name="Xeb773d5d6df880fa173685041e402e9bda411ca"/>
+    <w:bookmarkStart w:id="119" w:name="Xeb773d5d6df880fa173685041e402e9bda411ca"/>
     <w:p>
       <w:pPr>
         <w:pStyle w:val="Heading1"/>
@@ -468,6 +468,23 @@
             <w:rStyle w:val="Hyperlink"/>
           </w:rPr>
           <w:t xml:space="preserve">Quick Reference Tables</w:t>
+        </w:r>
+      </w:hyperlink>
+    </w:p>
+    <w:p>
+      <w:pPr>
+        <w:numPr>
+          <w:ilvl w:val="0"/>
+          <w:numId w:val="1001"/>
+        </w:numPr>
+        <w:pStyle w:val="Compact"/>
+      </w:pPr>
+      <w:hyperlink w:anchor="X5f4dd64ebb8c3c6d5ae119a7dfb9afa0cabd718">
+        <w:r>
+          <w:rPr>
+            <w:rStyle w:val="Hyperlink"/>
+          </w:rPr>
+          <w:t xml:space="preserve">SKU-Level Capacity &amp; Quota Groups (Phase 1)</w:t>
         </w:r>
       </w:hyperlink>
     </w:p>
@@ -15741,21 +15758,2216 @@
         </w:pict>
       </w:r>
     </w:p>
-    <w:p>
-      <w:pPr>
-        <w:pStyle w:val="FirstParagraph"/>
-      </w:pPr>
+    <w:bookmarkEnd w:id="109"/>
+    <w:bookmarkEnd w:id="110"/>
+    <w:bookmarkStart w:id="118" w:name="sku-level-capacity-quota-groups-phase-1"/>
+    <w:p>
+      <w:pPr>
+        <w:pStyle w:val="Heading2"/>
+      </w:pPr>
+      <w:r>
+        <w:t xml:space="preserve">11. SKU-Level Capacity &amp; Quota Groups (Phase 1)</w:t>
+      </w:r>
+    </w:p>
+    <w:p>
+      <w:pPr>
+        <w:pStyle w:val="BlockText"/>
+      </w:pPr>
+      <w:r>
+        <w:rPr>
+          <w:bCs/>
+          <w:b/>
+        </w:rPr>
+        <w:t xml:space="preserve">What this is.</w:t>
+      </w:r>
+      <w:r>
+        <w:t xml:space="preserve"> </w:t>
+      </w:r>
+      <w:r>
+        <w:t xml:space="preserve">Phase 1 adds five new sheets that surface capacity and quota at the</w:t>
+      </w:r>
+      <w:r>
+        <w:t xml:space="preserve"> </w:t>
+      </w:r>
+      <w:r>
+        <w:rPr>
+          <w:bCs/>
+          <w:b/>
+        </w:rPr>
+        <w:t xml:space="preserve">grain the baseline already mandates</w:t>
+      </w:r>
+      <w:r>
+        <w:t xml:space="preserve"> </w:t>
+      </w:r>
+      <w:r>
+        <w:t xml:space="preserve">— capacity</w:t>
+      </w:r>
+      <w:r>
+        <w:t xml:space="preserve"> </w:t>
+      </w:r>
+      <w:r>
+        <w:rPr>
+          <w:bCs/>
+          <w:b/>
+        </w:rPr>
+        <w:t xml:space="preserve">by SKU</w:t>
+      </w:r>
+      <w:r>
+        <w:t xml:space="preserve"> </w:t>
+      </w:r>
+      <w:r>
+        <w:t xml:space="preserve">(CAP-022/023) and quota</w:t>
+      </w:r>
+      <w:r>
+        <w:t xml:space="preserve"> </w:t>
+      </w:r>
+      <w:r>
+        <w:rPr>
+          <w:bCs/>
+          <w:b/>
+        </w:rPr>
+        <w:t xml:space="preserve">by VM/quota family</w:t>
+      </w:r>
+      <w:r>
+        <w:t xml:space="preserve"> </w:t>
+      </w:r>
+      <w:r>
+        <w:t xml:space="preserve">(QUA-002/003/004) — rather than as a single blended per-region number. It is</w:t>
+      </w:r>
+      <w:r>
+        <w:t xml:space="preserve"> </w:t>
+      </w:r>
+      <w:r>
+        <w:rPr>
+          <w:bCs/>
+          <w:b/>
+        </w:rPr>
+        <w:t xml:space="preserve">read-only / feasibility</w:t>
+      </w:r>
+      <w:r>
+        <w:t xml:space="preserve">: it does not change the v2.4 baseline and does not yet feed the Prod/CVAL/DR scoring engine (that is Phase 2). It exists so reviewers can see the SKU→family→quota-group machinery working on real usage data before we wire it into placement.</w:t>
+      </w:r>
+    </w:p>
+    <w:bookmarkStart w:id="111" w:name="why-two-grains-sku-vs-family"/>
+    <w:p>
+      <w:pPr>
+        <w:pStyle w:val="Heading3"/>
+      </w:pPr>
+      <w:r>
+        <w:t xml:space="preserve">11.1 Why two grains (SKU vs family)</w:t>
+      </w:r>
+    </w:p>
+    <w:p>
+      <w:pPr>
+        <w:numPr>
+          <w:ilvl w:val="0"/>
+          <w:numId w:val="1007"/>
+        </w:numPr>
+      </w:pPr>
+      <w:r>
+        <w:rPr>
+          <w:bCs/>
+          <w:b/>
+        </w:rPr>
+        <w:t xml:space="preserve">Capacity is reserved per SKU.</w:t>
+      </w:r>
+      <w:r>
+        <w:t xml:space="preserve"> </w:t>
+      </w:r>
+      <w:r>
+        <w:t xml:space="preserve">A Capacity Reservation Group (CRG) holds cores for one specific SKU (e.g. </w:t>
+      </w:r>
+      <w:r>
+        <w:rPr>
+          <w:rStyle w:val="VerbatimChar"/>
+        </w:rPr>
+        <w:t xml:space="preserve">Standard_E32ads_v5</w:t>
+      </w:r>
+      <w:r>
+        <w:t xml:space="preserve">) in one region/zone. This is the</w:t>
+      </w:r>
+      <w:r>
+        <w:t xml:space="preserve"> </w:t>
+      </w:r>
       <w:r>
         <w:rPr>
           <w:iCs/>
           <w:i/>
         </w:rPr>
-        <w:t xml:space="preserve">End of User Guide — baseline v2.4 · Last updated: 21 Sep 2026</w:t>
-      </w:r>
-    </w:p>
-    <w:bookmarkEnd w:id="109"/>
-    <w:bookmarkEnd w:id="110"/>
+        <w:t xml:space="preserve">reservation</w:t>
+      </w:r>
+      <w:r>
+        <w:t xml:space="preserve"> </w:t>
+      </w:r>
+      <w:r>
+        <w:t xml:space="preserve">grain.</w:t>
+      </w:r>
+    </w:p>
+    <w:p>
+      <w:pPr>
+        <w:numPr>
+          <w:ilvl w:val="0"/>
+          <w:numId w:val="1007"/>
+        </w:numPr>
+      </w:pPr>
+      <w:r>
+        <w:rPr>
+          <w:bCs/>
+          <w:b/>
+        </w:rPr>
+        <w:t xml:space="preserve">Quota is granted per VM/quota family.</w:t>
+      </w:r>
+      <w:r>
+        <w:t xml:space="preserve"> </w:t>
+      </w:r>
+      <w:r>
+        <w:t xml:space="preserve">Azure counts your regional vCPU quota against a</w:t>
+      </w:r>
+      <w:r>
+        <w:t xml:space="preserve"> </w:t>
+      </w:r>
+      <w:r>
+        <w:rPr>
+          <w:iCs/>
+          <w:i/>
+        </w:rPr>
+        <w:t xml:space="preserve">family</w:t>
+      </w:r>
+      <w:r>
+        <w:t xml:space="preserve"> </w:t>
+      </w:r>
+      <w:r>
+        <w:t xml:space="preserve">(e.g. </w:t>
+      </w:r>
+      <w:r>
+        <w:rPr>
+          <w:rStyle w:val="VerbatimChar"/>
+        </w:rPr>
+        <w:t xml:space="preserve">Eadsv5</w:t>
+      </w:r>
+      <w:r>
+        <w:t xml:space="preserve">), and many SKUs draw on the same family. This is the</w:t>
+      </w:r>
+      <w:r>
+        <w:t xml:space="preserve"> </w:t>
+      </w:r>
+      <w:r>
+        <w:rPr>
+          <w:iCs/>
+          <w:i/>
+        </w:rPr>
+        <w:t xml:space="preserve">quota</w:t>
+      </w:r>
+      <w:r>
+        <w:t xml:space="preserve"> </w:t>
+      </w:r>
+      <w:r>
+        <w:t xml:space="preserve">grain.</w:t>
+      </w:r>
+    </w:p>
+    <w:p>
+      <w:pPr>
+        <w:numPr>
+          <w:ilvl w:val="0"/>
+          <w:numId w:val="1007"/>
+        </w:numPr>
+      </w:pPr>
+      <w:r>
+        <w:t xml:space="preserve">A deployment is only placeable when</w:t>
+      </w:r>
+      <w:r>
+        <w:t xml:space="preserve"> </w:t>
+      </w:r>
+      <w:r>
+        <w:rPr>
+          <w:bCs/>
+          <w:b/>
+        </w:rPr>
+        <w:t xml:space="preserve">both</w:t>
+      </w:r>
+      <w:r>
+        <w:t xml:space="preserve"> </w:t>
+      </w:r>
+      <w:r>
+        <w:t xml:space="preserve">hold. Phase 1 makes this explicit with a join:</w:t>
+      </w:r>
+    </w:p>
+    <w:p>
+      <w:pPr>
+        <w:numPr>
+          <w:ilvl w:val="0"/>
+          <w:numId w:val="1000"/>
+        </w:numPr>
+        <w:pStyle w:val="SourceCode"/>
+      </w:pPr>
+      <w:r>
+        <w:rPr>
+          <w:rStyle w:val="VerbatimChar"/>
+        </w:rPr>
+        <w:t xml:space="preserve">GROUP AVAIL = MIN( reserved-free cores for the SKU ,  quota available for its family )</w:t>
+      </w:r>
+    </w:p>
+    <w:p>
+      <w:pPr>
+        <w:numPr>
+          <w:ilvl w:val="0"/>
+          <w:numId w:val="1000"/>
+        </w:numPr>
+      </w:pPr>
+      <w:r>
+        <w:t xml:space="preserve">This single MIN is the heart of Phase 1 — it is why capacity and quota must be modelled on separate planes and reconciled per candidate.</w:t>
+      </w:r>
+    </w:p>
     <w:bookmarkEnd w:id="111"/>
+    <w:bookmarkStart w:id="112" w:name="the-five-new-sheets"/>
+    <w:p>
+      <w:pPr>
+        <w:pStyle w:val="Heading3"/>
+      </w:pPr>
+      <w:r>
+        <w:t xml:space="preserve">11.2 The five new sheets</w:t>
+      </w:r>
+    </w:p>
+    <w:tbl>
+      <w:tblPr>
+        <w:tblStyle w:val="Table"/>
+        <w:tblW w:type="pct" w:w="5000"/>
+        <w:tblLook w:firstRow="1" w:lastRow="0" w:firstColumn="0" w:lastColumn="0" w:noHBand="0" w:noVBand="0" w:val="0020"/>
+      </w:tblPr>
+      <w:tblGrid>
+        <w:gridCol w:w="2772"/>
+        <w:gridCol w:w="2772"/>
+        <w:gridCol w:w="2376"/>
+      </w:tblGrid>
+      <w:tr>
+        <w:trPr>
+          <w:tblHeader w:val="true"/>
+        </w:trPr>
+        <w:tc>
+          <w:tcPr/>
+          <w:p>
+            <w:pPr>
+              <w:pStyle w:val="Compact"/>
+              <w:jc w:val="left"/>
+            </w:pPr>
+            <w:r>
+              <w:t xml:space="preserve">Sheet</w:t>
+            </w:r>
+          </w:p>
+        </w:tc>
+        <w:tc>
+          <w:tcPr/>
+          <w:p>
+            <w:pPr>
+              <w:pStyle w:val="Compact"/>
+              <w:jc w:val="left"/>
+            </w:pPr>
+            <w:r>
+              <w:t xml:space="preserve">Grain</w:t>
+            </w:r>
+          </w:p>
+        </w:tc>
+        <w:tc>
+          <w:tcPr/>
+          <w:p>
+            <w:pPr>
+              <w:pStyle w:val="Compact"/>
+              <w:jc w:val="left"/>
+            </w:pPr>
+            <w:r>
+              <w:t xml:space="preserve">Role</w:t>
+            </w:r>
+          </w:p>
+        </w:tc>
+      </w:tr>
+      <w:tr>
+        <w:tc>
+          <w:tcPr/>
+          <w:p>
+            <w:pPr>
+              <w:pStyle w:val="Compact"/>
+              <w:jc w:val="left"/>
+            </w:pPr>
+            <w:r>
+              <w:rPr>
+                <w:bCs/>
+                <w:b/>
+              </w:rPr>
+              <w:t xml:space="preserve">SKU_Family_Map</w:t>
+            </w:r>
+          </w:p>
+        </w:tc>
+        <w:tc>
+          <w:tcPr/>
+          <w:p>
+            <w:pPr>
+              <w:pStyle w:val="Compact"/>
+              <w:jc w:val="left"/>
+            </w:pPr>
+            <w:r>
+              <w:t xml:space="preserve">SKU → family</w:t>
+            </w:r>
+          </w:p>
+        </w:tc>
+        <w:tc>
+          <w:tcPr/>
+          <w:p>
+            <w:pPr>
+              <w:pStyle w:val="Compact"/>
+              <w:jc w:val="left"/>
+            </w:pPr>
+            <w:r>
+              <w:t xml:space="preserve">Lookup table (</w:t>
+            </w:r>
+            <w:r>
+              <w:rPr>
+                <w:rStyle w:val="VerbatimChar"/>
+              </w:rPr>
+              <w:t xml:space="preserve">VLOOKUP</w:t>
+            </w:r>
+            <w:r>
+              <w:t xml:space="preserve"> </w:t>
+            </w:r>
+            <w:r>
+              <w:t xml:space="preserve">source) mapping each modelled SKU to its quota family.</w:t>
+            </w:r>
+          </w:p>
+        </w:tc>
+      </w:tr>
+      <w:tr>
+        <w:tc>
+          <w:tcPr/>
+          <w:p>
+            <w:pPr>
+              <w:pStyle w:val="Compact"/>
+              <w:jc w:val="left"/>
+            </w:pPr>
+            <w:r>
+              <w:rPr>
+                <w:bCs/>
+                <w:b/>
+              </w:rPr>
+              <w:t xml:space="preserve">SKU_Catalogue</w:t>
+            </w:r>
+          </w:p>
+        </w:tc>
+        <w:tc>
+          <w:tcPr/>
+          <w:p>
+            <w:pPr>
+              <w:pStyle w:val="Compact"/>
+              <w:jc w:val="left"/>
+            </w:pPr>
+            <w:r>
+              <w:t xml:space="preserve">one row per SKU</w:t>
+            </w:r>
+          </w:p>
+        </w:tc>
+        <w:tc>
+          <w:tcPr/>
+          <w:p>
+            <w:pPr>
+              <w:pStyle w:val="Compact"/>
+              <w:jc w:val="left"/>
+            </w:pPr>
+            <w:r>
+              <w:t xml:space="preserve">The 8 modelled SKUs with vCPU/instance, family, zonal &amp; eligibility flags, real observed cores, notes.</w:t>
+            </w:r>
+          </w:p>
+        </w:tc>
+      </w:tr>
+      <w:tr>
+        <w:tc>
+          <w:tcPr/>
+          <w:p>
+            <w:pPr>
+              <w:pStyle w:val="Compact"/>
+              <w:jc w:val="left"/>
+            </w:pPr>
+            <w:r>
+              <w:rPr>
+                <w:bCs/>
+                <w:b/>
+              </w:rPr>
+              <w:t xml:space="preserve">Capacity_By_SKU</w:t>
+            </w:r>
+          </w:p>
+        </w:tc>
+        <w:tc>
+          <w:tcPr/>
+          <w:p>
+            <w:pPr>
+              <w:pStyle w:val="Compact"/>
+              <w:jc w:val="left"/>
+            </w:pPr>
+            <w:r>
+              <w:t xml:space="preserve">Region × Environment × SKU</w:t>
+            </w:r>
+          </w:p>
+        </w:tc>
+        <w:tc>
+          <w:tcPr/>
+          <w:p>
+            <w:pPr>
+              <w:pStyle w:val="Compact"/>
+              <w:jc w:val="left"/>
+            </w:pPr>
+            <w:r>
+              <w:t xml:space="preserve">The reservation plane: allocated, buffer, reserved, reserved-free, and the MIN join to quota. 192 rows (8 regions × 3 envs × 8 SKUs).</w:t>
+            </w:r>
+          </w:p>
+        </w:tc>
+      </w:tr>
+      <w:tr>
+        <w:tc>
+          <w:tcPr/>
+          <w:p>
+            <w:pPr>
+              <w:pStyle w:val="Compact"/>
+              <w:jc w:val="left"/>
+            </w:pPr>
+            <w:r>
+              <w:rPr>
+                <w:bCs/>
+                <w:b/>
+              </w:rPr>
+              <w:t xml:space="preserve">Quota_Groups</w:t>
+            </w:r>
+          </w:p>
+        </w:tc>
+        <w:tc>
+          <w:tcPr/>
+          <w:p>
+            <w:pPr>
+              <w:pStyle w:val="Compact"/>
+              <w:jc w:val="left"/>
+            </w:pPr>
+            <w:r>
+              <w:t xml:space="preserve">Region × Family</w:t>
+            </w:r>
+          </w:p>
+        </w:tc>
+        <w:tc>
+          <w:tcPr/>
+          <w:p>
+            <w:pPr>
+              <w:pStyle w:val="Compact"/>
+              <w:jc w:val="left"/>
+            </w:pPr>
+            <w:r>
+              <w:t xml:space="preserve">The pooled quota plane: one group per region+family, group limit / used / available, hoarded contribution. 32 rows (8 regions × 4 families).</w:t>
+            </w:r>
+          </w:p>
+        </w:tc>
+      </w:tr>
+      <w:tr>
+        <w:tc>
+          <w:tcPr/>
+          <w:p>
+            <w:pPr>
+              <w:pStyle w:val="Compact"/>
+              <w:jc w:val="left"/>
+            </w:pPr>
+            <w:r>
+              <w:rPr>
+                <w:bCs/>
+                <w:b/>
+              </w:rPr>
+              <w:t xml:space="preserve">SKU_Grain_ReadMe</w:t>
+            </w:r>
+          </w:p>
+        </w:tc>
+        <w:tc>
+          <w:tcPr/>
+          <w:p>
+            <w:pPr>
+              <w:pStyle w:val="Compact"/>
+              <w:jc w:val="left"/>
+            </w:pPr>
+            <w:r>
+              <w:t xml:space="preserve">—</w:t>
+            </w:r>
+          </w:p>
+        </w:tc>
+        <w:tc>
+          <w:tcPr/>
+          <w:p>
+            <w:pPr>
+              <w:pStyle w:val="Compact"/>
+              <w:jc w:val="left"/>
+            </w:pPr>
+            <w:r>
+              <w:t xml:space="preserve">In-workbook explainer for the above.</w:t>
+            </w:r>
+          </w:p>
+        </w:tc>
+      </w:tr>
+    </w:tbl>
+    <w:bookmarkEnd w:id="112"/>
+    <w:bookmarkStart w:id="113" w:name="Xa63a56c7b91b443c20f83a5e5c2e6c0e3133614"/>
+    <w:p>
+      <w:pPr>
+        <w:pStyle w:val="Heading3"/>
+      </w:pPr>
+      <w:r>
+        <w:t xml:space="preserve">11.3 Capacity_By_SKU — column reference (header row 4, data from row 5)</w:t>
+      </w:r>
+    </w:p>
+    <w:tbl>
+      <w:tblPr>
+        <w:tblStyle w:val="Table"/>
+        <w:tblW w:type="pct" w:w="5000"/>
+        <w:tblLook w:firstRow="1" w:lastRow="0" w:firstColumn="0" w:lastColumn="0" w:noHBand="0" w:noVBand="0" w:val="0020"/>
+      </w:tblPr>
+      <w:tblGrid>
+        <w:gridCol w:w="1320"/>
+        <w:gridCol w:w="1848"/>
+        <w:gridCol w:w="4752"/>
+      </w:tblGrid>
+      <w:tr>
+        <w:trPr>
+          <w:tblHeader w:val="true"/>
+        </w:trPr>
+        <w:tc>
+          <w:tcPr/>
+          <w:p>
+            <w:pPr>
+              <w:pStyle w:val="Compact"/>
+              <w:jc w:val="left"/>
+            </w:pPr>
+            <w:r>
+              <w:t xml:space="preserve">Col</w:t>
+            </w:r>
+          </w:p>
+        </w:tc>
+        <w:tc>
+          <w:tcPr/>
+          <w:p>
+            <w:pPr>
+              <w:pStyle w:val="Compact"/>
+              <w:jc w:val="left"/>
+            </w:pPr>
+            <w:r>
+              <w:t xml:space="preserve">Field</w:t>
+            </w:r>
+          </w:p>
+        </w:tc>
+        <w:tc>
+          <w:tcPr/>
+          <w:p>
+            <w:pPr>
+              <w:pStyle w:val="Compact"/>
+              <w:jc w:val="left"/>
+            </w:pPr>
+            <w:r>
+              <w:t xml:space="preserve">Source / formula</w:t>
+            </w:r>
+          </w:p>
+        </w:tc>
+      </w:tr>
+      <w:tr>
+        <w:tc>
+          <w:tcPr/>
+          <w:p>
+            <w:pPr>
+              <w:pStyle w:val="Compact"/>
+              <w:jc w:val="left"/>
+            </w:pPr>
+            <w:r>
+              <w:t xml:space="preserve">A–C</w:t>
+            </w:r>
+          </w:p>
+        </w:tc>
+        <w:tc>
+          <w:tcPr/>
+          <w:p>
+            <w:pPr>
+              <w:pStyle w:val="Compact"/>
+              <w:jc w:val="left"/>
+            </w:pPr>
+            <w:r>
+              <w:t xml:space="preserve">Region, Geography, Environment</w:t>
+            </w:r>
+          </w:p>
+        </w:tc>
+        <w:tc>
+          <w:tcPr/>
+          <w:p>
+            <w:pPr>
+              <w:pStyle w:val="Compact"/>
+              <w:jc w:val="left"/>
+            </w:pPr>
+            <w:r>
+              <w:t xml:space="preserve">Seeded (grain keys)</w:t>
+            </w:r>
+          </w:p>
+        </w:tc>
+      </w:tr>
+      <w:tr>
+        <w:tc>
+          <w:tcPr/>
+          <w:p>
+            <w:pPr>
+              <w:pStyle w:val="Compact"/>
+              <w:jc w:val="left"/>
+            </w:pPr>
+            <w:r>
+              <w:t xml:space="preserve">D</w:t>
+            </w:r>
+          </w:p>
+        </w:tc>
+        <w:tc>
+          <w:tcPr/>
+          <w:p>
+            <w:pPr>
+              <w:pStyle w:val="Compact"/>
+              <w:jc w:val="left"/>
+            </w:pPr>
+            <w:r>
+              <w:t xml:space="preserve">SKU</w:t>
+            </w:r>
+          </w:p>
+        </w:tc>
+        <w:tc>
+          <w:tcPr/>
+          <w:p>
+            <w:pPr>
+              <w:pStyle w:val="Compact"/>
+              <w:jc w:val="left"/>
+            </w:pPr>
+            <w:r>
+              <w:t xml:space="preserve">Seeded (</w:t>
+            </w:r>
+            <w:r>
+              <w:rPr>
+                <w:rStyle w:val="VerbatimChar"/>
+              </w:rPr>
+              <w:t xml:space="preserve">Standard_*</w:t>
+            </w:r>
+            <w:r>
+              <w:t xml:space="preserve">)</w:t>
+            </w:r>
+          </w:p>
+        </w:tc>
+      </w:tr>
+      <w:tr>
+        <w:tc>
+          <w:tcPr/>
+          <w:p>
+            <w:pPr>
+              <w:pStyle w:val="Compact"/>
+              <w:jc w:val="left"/>
+            </w:pPr>
+            <w:r>
+              <w:t xml:space="preserve">E</w:t>
+            </w:r>
+          </w:p>
+        </w:tc>
+        <w:tc>
+          <w:tcPr/>
+          <w:p>
+            <w:pPr>
+              <w:pStyle w:val="Compact"/>
+              <w:jc w:val="left"/>
+            </w:pPr>
+            <w:r>
+              <w:t xml:space="preserve">Family</w:t>
+            </w:r>
+          </w:p>
+        </w:tc>
+        <w:tc>
+          <w:tcPr/>
+          <w:p>
+            <w:pPr>
+              <w:pStyle w:val="Compact"/>
+              <w:jc w:val="left"/>
+            </w:pPr>
+            <w:r>
+              <w:rPr>
+                <w:rStyle w:val="VerbatimChar"/>
+              </w:rPr>
+              <w:t xml:space="preserve">=VLOOKUP(D,SKU_Family_Map!$A:$B,2,FALSE)</w:t>
+            </w:r>
+          </w:p>
+        </w:tc>
+      </w:tr>
+      <w:tr>
+        <w:tc>
+          <w:tcPr/>
+          <w:p>
+            <w:pPr>
+              <w:pStyle w:val="Compact"/>
+              <w:jc w:val="left"/>
+            </w:pPr>
+            <w:r>
+              <w:t xml:space="preserve">F</w:t>
+            </w:r>
+          </w:p>
+        </w:tc>
+        <w:tc>
+          <w:tcPr/>
+          <w:p>
+            <w:pPr>
+              <w:pStyle w:val="Compact"/>
+              <w:jc w:val="left"/>
+            </w:pPr>
+            <w:r>
+              <w:t xml:space="preserve">CRG (CAP-023)</w:t>
+            </w:r>
+          </w:p>
+        </w:tc>
+        <w:tc>
+          <w:tcPr/>
+          <w:p>
+            <w:pPr>
+              <w:pStyle w:val="Compact"/>
+              <w:jc w:val="left"/>
+            </w:pPr>
+            <w:r>
+              <w:t xml:space="preserve">Naming only,</w:t>
+            </w:r>
+            <w:r>
+              <w:t xml:space="preserve"> </w:t>
+            </w:r>
+            <w:r>
+              <w:rPr>
+                <w:rStyle w:val="VerbatimChar"/>
+              </w:rPr>
+              <w:t xml:space="preserve">crg-{pr\|np\|dr}-{regabbr}-reg</w:t>
+            </w:r>
+            <w:r>
+              <w:t xml:space="preserve"> </w:t>
+            </w:r>
+            <w:r>
+              <w:t xml:space="preserve">(regional scope; per-AZ deferred to a later phase)</w:t>
+            </w:r>
+          </w:p>
+        </w:tc>
+      </w:tr>
+      <w:tr>
+        <w:tc>
+          <w:tcPr/>
+          <w:p>
+            <w:pPr>
+              <w:pStyle w:val="Compact"/>
+              <w:jc w:val="left"/>
+            </w:pPr>
+            <w:r>
+              <w:t xml:space="preserve">G</w:t>
+            </w:r>
+          </w:p>
+        </w:tc>
+        <w:tc>
+          <w:tcPr/>
+          <w:p>
+            <w:pPr>
+              <w:pStyle w:val="Compact"/>
+              <w:jc w:val="left"/>
+            </w:pPr>
+            <w:r>
+              <w:t xml:space="preserve">vCPU/inst</w:t>
+            </w:r>
+          </w:p>
+        </w:tc>
+        <w:tc>
+          <w:tcPr/>
+          <w:p>
+            <w:pPr>
+              <w:pStyle w:val="Compact"/>
+              <w:jc w:val="left"/>
+            </w:pPr>
+            <w:r>
+              <w:t xml:space="preserve">From SKU_Catalogue</w:t>
+            </w:r>
+          </w:p>
+        </w:tc>
+      </w:tr>
+      <w:tr>
+        <w:tc>
+          <w:tcPr/>
+          <w:p>
+            <w:pPr>
+              <w:pStyle w:val="Compact"/>
+              <w:jc w:val="left"/>
+            </w:pPr>
+            <w:r>
+              <w:t xml:space="preserve">H</w:t>
+            </w:r>
+          </w:p>
+        </w:tc>
+        <w:tc>
+          <w:tcPr/>
+          <w:p>
+            <w:pPr>
+              <w:pStyle w:val="Compact"/>
+              <w:jc w:val="left"/>
+            </w:pPr>
+            <w:r>
+              <w:t xml:space="preserve">Allocated</w:t>
+            </w:r>
+          </w:p>
+        </w:tc>
+        <w:tc>
+          <w:tcPr/>
+          <w:p>
+            <w:pPr>
+              <w:pStyle w:val="Compact"/>
+              <w:jc w:val="left"/>
+            </w:pPr>
+            <w:r>
+              <w:t xml:space="preserve">Derived from real usage (</w:t>
+            </w:r>
+            <w:r>
+              <w:rPr>
+                <w:rStyle w:val="VerbatimChar"/>
+              </w:rPr>
+              <w:t xml:space="preserve">SKU_USage.xlsx</w:t>
+            </w:r>
+            <w:r>
+              <w:t xml:space="preserve">); Canada Central is a mock (0.5 × mean of other US regions); DR = 30% of Prod (ENV-005 bootstrap, not a full duplicate)</w:t>
+            </w:r>
+          </w:p>
+        </w:tc>
+      </w:tr>
+      <w:tr>
+        <w:tc>
+          <w:tcPr/>
+          <w:p>
+            <w:pPr>
+              <w:pStyle w:val="Compact"/>
+              <w:jc w:val="left"/>
+            </w:pPr>
+            <w:r>
+              <w:t xml:space="preserve">I</w:t>
+            </w:r>
+          </w:p>
+        </w:tc>
+        <w:tc>
+          <w:tcPr/>
+          <w:p>
+            <w:pPr>
+              <w:pStyle w:val="Compact"/>
+              <w:jc w:val="left"/>
+            </w:pPr>
+            <w:r>
+              <w:t xml:space="preserve">Buffer</w:t>
+            </w:r>
+          </w:p>
+        </w:tc>
+        <w:tc>
+          <w:tcPr/>
+          <w:p>
+            <w:pPr>
+              <w:pStyle w:val="Compact"/>
+              <w:jc w:val="left"/>
+            </w:pPr>
+            <w:r>
+              <w:rPr>
+                <w:rStyle w:val="VerbatimChar"/>
+              </w:rPr>
+              <w:t xml:space="preserve">max(8, round(0.12 × Allocated))</w:t>
+            </w:r>
+            <w:r>
+              <w:t xml:space="preserve"> </w:t>
+            </w:r>
+            <w:r>
+              <w:t xml:space="preserve">(CAP-003 headroom)</w:t>
+            </w:r>
+          </w:p>
+        </w:tc>
+      </w:tr>
+      <w:tr>
+        <w:tc>
+          <w:tcPr/>
+          <w:p>
+            <w:pPr>
+              <w:pStyle w:val="Compact"/>
+              <w:jc w:val="left"/>
+            </w:pPr>
+            <w:r>
+              <w:t xml:space="preserve">J</w:t>
+            </w:r>
+          </w:p>
+        </w:tc>
+        <w:tc>
+          <w:tcPr/>
+          <w:p>
+            <w:pPr>
+              <w:pStyle w:val="Compact"/>
+              <w:jc w:val="left"/>
+            </w:pPr>
+            <w:r>
+              <w:t xml:space="preserve">Reserved</w:t>
+            </w:r>
+          </w:p>
+        </w:tc>
+        <w:tc>
+          <w:tcPr/>
+          <w:p>
+            <w:pPr>
+              <w:pStyle w:val="Compact"/>
+              <w:jc w:val="left"/>
+            </w:pPr>
+            <w:r>
+              <w:rPr>
+                <w:rStyle w:val="VerbatimChar"/>
+              </w:rPr>
+              <w:t xml:space="preserve">=H+I</w:t>
+            </w:r>
+            <w:r>
+              <w:t xml:space="preserve"> </w:t>
+            </w:r>
+            <w:r>
+              <w:t xml:space="preserve">(CAP-003 Target = Allocated + Buffer)</w:t>
+            </w:r>
+          </w:p>
+        </w:tc>
+      </w:tr>
+      <w:tr>
+        <w:tc>
+          <w:tcPr/>
+          <w:p>
+            <w:pPr>
+              <w:pStyle w:val="Compact"/>
+              <w:jc w:val="left"/>
+            </w:pPr>
+            <w:r>
+              <w:t xml:space="preserve">K</w:t>
+            </w:r>
+          </w:p>
+        </w:tc>
+        <w:tc>
+          <w:tcPr/>
+          <w:p>
+            <w:pPr>
+              <w:pStyle w:val="Compact"/>
+              <w:jc w:val="left"/>
+            </w:pPr>
+            <w:r>
+              <w:t xml:space="preserve">Reserved-Free</w:t>
+            </w:r>
+          </w:p>
+        </w:tc>
+        <w:tc>
+          <w:tcPr/>
+          <w:p>
+            <w:pPr>
+              <w:pStyle w:val="Compact"/>
+              <w:jc w:val="left"/>
+            </w:pPr>
+            <w:r>
+              <w:rPr>
+                <w:rStyle w:val="VerbatimChar"/>
+              </w:rPr>
+              <w:t xml:space="preserve">=J−H</w:t>
+            </w:r>
+            <w:r>
+              <w:t xml:space="preserve"> </w:t>
+            </w:r>
+            <w:r>
+              <w:t xml:space="preserve">(free portion of the reservation = buffer headroom)</w:t>
+            </w:r>
+          </w:p>
+        </w:tc>
+      </w:tr>
+      <w:tr>
+        <w:tc>
+          <w:tcPr/>
+          <w:p>
+            <w:pPr>
+              <w:pStyle w:val="Compact"/>
+              <w:jc w:val="left"/>
+            </w:pPr>
+            <w:r>
+              <w:t xml:space="preserve">L</w:t>
+            </w:r>
+          </w:p>
+        </w:tc>
+        <w:tc>
+          <w:tcPr/>
+          <w:p>
+            <w:pPr>
+              <w:pStyle w:val="Compact"/>
+              <w:jc w:val="left"/>
+            </w:pPr>
+            <w:r>
+              <w:t xml:space="preserve">Family Quota-Avail</w:t>
+            </w:r>
+          </w:p>
+        </w:tc>
+        <w:tc>
+          <w:tcPr/>
+          <w:p>
+            <w:pPr>
+              <w:pStyle w:val="Compact"/>
+              <w:jc w:val="left"/>
+            </w:pPr>
+            <w:r>
+              <w:rPr>
+                <w:rStyle w:val="VerbatimChar"/>
+              </w:rPr>
+              <w:t xml:space="preserve">=SUMIFS(Quota_Groups!$G:$G, …region, …family)</w:t>
+            </w:r>
+            <w:r>
+              <w:t xml:space="preserve"> </w:t>
+            </w:r>
+            <w:r>
+              <w:t xml:space="preserve">— pulls the pooled group’s available cores</w:t>
+            </w:r>
+          </w:p>
+        </w:tc>
+      </w:tr>
+      <w:tr>
+        <w:tc>
+          <w:tcPr/>
+          <w:p>
+            <w:pPr>
+              <w:pStyle w:val="Compact"/>
+              <w:jc w:val="left"/>
+            </w:pPr>
+            <w:r>
+              <w:rPr>
+                <w:bCs/>
+                <w:b/>
+              </w:rPr>
+              <w:t xml:space="preserve">M</w:t>
+            </w:r>
+          </w:p>
+        </w:tc>
+        <w:tc>
+          <w:tcPr/>
+          <w:p>
+            <w:pPr>
+              <w:pStyle w:val="Compact"/>
+              <w:jc w:val="left"/>
+            </w:pPr>
+            <w:r>
+              <w:rPr>
+                <w:bCs/>
+                <w:b/>
+              </w:rPr>
+              <w:t xml:space="preserve">GROUP AVAIL (MIN)</w:t>
+            </w:r>
+          </w:p>
+        </w:tc>
+        <w:tc>
+          <w:tcPr/>
+          <w:p>
+            <w:pPr>
+              <w:pStyle w:val="Compact"/>
+              <w:jc w:val="left"/>
+            </w:pPr>
+            <w:r>
+              <w:rPr>
+                <w:rStyle w:val="VerbatimChar"/>
+                <w:bCs/>
+                <w:b/>
+              </w:rPr>
+              <w:t xml:space="preserve">=MIN(K,L)</w:t>
+            </w:r>
+            <w:r>
+              <w:t xml:space="preserve"> </w:t>
+            </w:r>
+            <w:r>
+              <w:t xml:space="preserve">— the binding capacity∩quota headroom (styled orange)</w:t>
+            </w:r>
+          </w:p>
+        </w:tc>
+      </w:tr>
+      <w:tr>
+        <w:tc>
+          <w:tcPr/>
+          <w:p>
+            <w:pPr>
+              <w:pStyle w:val="Compact"/>
+              <w:jc w:val="left"/>
+            </w:pPr>
+            <w:r>
+              <w:t xml:space="preserve">N</w:t>
+            </w:r>
+          </w:p>
+        </w:tc>
+        <w:tc>
+          <w:tcPr/>
+          <w:p>
+            <w:pPr>
+              <w:pStyle w:val="Compact"/>
+              <w:jc w:val="left"/>
+            </w:pPr>
+            <w:r>
+              <w:t xml:space="preserve">Binding Constraint</w:t>
+            </w:r>
+          </w:p>
+        </w:tc>
+        <w:tc>
+          <w:tcPr/>
+          <w:p>
+            <w:pPr>
+              <w:pStyle w:val="Compact"/>
+              <w:jc w:val="left"/>
+            </w:pPr>
+            <w:r>
+              <w:rPr>
+                <w:rStyle w:val="VerbatimChar"/>
+              </w:rPr>
+              <w:t xml:space="preserve">=IF(K&lt;=L,"CAPACITY","QUOTA")</w:t>
+            </w:r>
+            <w:r>
+              <w:t xml:space="preserve"> </w:t>
+            </w:r>
+            <w:r>
+              <w:t xml:space="preserve">— which plane is the limiter</w:t>
+            </w:r>
+          </w:p>
+        </w:tc>
+      </w:tr>
+      <w:tr>
+        <w:tc>
+          <w:tcPr/>
+          <w:p>
+            <w:pPr>
+              <w:pStyle w:val="Compact"/>
+              <w:jc w:val="left"/>
+            </w:pPr>
+            <w:r>
+              <w:t xml:space="preserve">O</w:t>
+            </w:r>
+          </w:p>
+        </w:tc>
+        <w:tc>
+          <w:tcPr/>
+          <w:p>
+            <w:pPr>
+              <w:pStyle w:val="Compact"/>
+              <w:jc w:val="left"/>
+            </w:pPr>
+            <w:r>
+              <w:t xml:space="preserve">Readiness (RDY-002)</w:t>
+            </w:r>
+          </w:p>
+        </w:tc>
+        <w:tc>
+          <w:tcPr/>
+          <w:p>
+            <w:pPr>
+              <w:pStyle w:val="Compact"/>
+              <w:jc w:val="left"/>
+            </w:pPr>
+            <w:r>
+              <w:rPr>
+                <w:rStyle w:val="VerbatimChar"/>
+              </w:rPr>
+              <w:t xml:space="preserve">READY</w:t>
+            </w:r>
+            <w:r>
+              <w:t xml:space="preserve"> </w:t>
+            </w:r>
+            <w:r>
+              <w:t xml:space="preserve">/</w:t>
+            </w:r>
+            <w:r>
+              <w:t xml:space="preserve"> </w:t>
+            </w:r>
+            <w:r>
+              <w:rPr>
+                <w:rStyle w:val="VerbatimChar"/>
+              </w:rPr>
+              <w:t xml:space="preserve">READY_WITH_RISK</w:t>
+            </w:r>
+            <w:r>
+              <w:t xml:space="preserve"> </w:t>
+            </w:r>
+            <w:r>
+              <w:t xml:space="preserve">/</w:t>
+            </w:r>
+            <w:r>
+              <w:t xml:space="preserve"> </w:t>
+            </w:r>
+            <w:r>
+              <w:rPr>
+                <w:rStyle w:val="VerbatimChar"/>
+              </w:rPr>
+              <w:t xml:space="preserve">QUOTA_DEFICIT</w:t>
+            </w:r>
+            <w:r>
+              <w:t xml:space="preserve"> </w:t>
+            </w:r>
+            <w:r>
+              <w:t xml:space="preserve">/</w:t>
+            </w:r>
+            <w:r>
+              <w:t xml:space="preserve"> </w:t>
+            </w:r>
+            <w:r>
+              <w:rPr>
+                <w:rStyle w:val="VerbatimChar"/>
+              </w:rPr>
+              <w:t xml:space="preserve">RESERVATION_DEFICIT</w:t>
+            </w:r>
+            <w:r>
+              <w:t xml:space="preserve"> </w:t>
+            </w:r>
+            <w:r>
+              <w:t xml:space="preserve">per the baseline’s readiness states</w:t>
+            </w:r>
+          </w:p>
+        </w:tc>
+      </w:tr>
+    </w:tbl>
+    <w:bookmarkEnd w:id="113"/>
+    <w:bookmarkStart w:id="114" w:name="X712cbd221c030fadd454124b84bc9ae831a3074"/>
+    <w:p>
+      <w:pPr>
+        <w:pStyle w:val="Heading3"/>
+      </w:pPr>
+      <w:r>
+        <w:t xml:space="preserve">11.4 Quota_Groups — column reference (header row 3, data from row 4)</w:t>
+      </w:r>
+    </w:p>
+    <w:tbl>
+      <w:tblPr>
+        <w:tblStyle w:val="Table"/>
+        <w:tblW w:type="pct" w:w="5000"/>
+        <w:tblLook w:firstRow="1" w:lastRow="0" w:firstColumn="0" w:lastColumn="0" w:noHBand="0" w:noVBand="0" w:val="0020"/>
+      </w:tblPr>
+      <w:tblGrid>
+        <w:gridCol w:w="1320"/>
+        <w:gridCol w:w="1848"/>
+        <w:gridCol w:w="4752"/>
+      </w:tblGrid>
+      <w:tr>
+        <w:trPr>
+          <w:tblHeader w:val="true"/>
+        </w:trPr>
+        <w:tc>
+          <w:tcPr/>
+          <w:p>
+            <w:pPr>
+              <w:pStyle w:val="Compact"/>
+              <w:jc w:val="left"/>
+            </w:pPr>
+            <w:r>
+              <w:t xml:space="preserve">Col</w:t>
+            </w:r>
+          </w:p>
+        </w:tc>
+        <w:tc>
+          <w:tcPr/>
+          <w:p>
+            <w:pPr>
+              <w:pStyle w:val="Compact"/>
+              <w:jc w:val="left"/>
+            </w:pPr>
+            <w:r>
+              <w:t xml:space="preserve">Field</w:t>
+            </w:r>
+          </w:p>
+        </w:tc>
+        <w:tc>
+          <w:tcPr/>
+          <w:p>
+            <w:pPr>
+              <w:pStyle w:val="Compact"/>
+              <w:jc w:val="left"/>
+            </w:pPr>
+            <w:r>
+              <w:t xml:space="preserve">Source / formula</w:t>
+            </w:r>
+          </w:p>
+        </w:tc>
+      </w:tr>
+      <w:tr>
+        <w:tc>
+          <w:tcPr/>
+          <w:p>
+            <w:pPr>
+              <w:pStyle w:val="Compact"/>
+              <w:jc w:val="left"/>
+            </w:pPr>
+            <w:r>
+              <w:t xml:space="preserve">A</w:t>
+            </w:r>
+          </w:p>
+        </w:tc>
+        <w:tc>
+          <w:tcPr/>
+          <w:p>
+            <w:pPr>
+              <w:pStyle w:val="Compact"/>
+              <w:jc w:val="left"/>
+            </w:pPr>
+            <w:r>
+              <w:t xml:space="preserve">Quota Group</w:t>
+            </w:r>
+          </w:p>
+        </w:tc>
+        <w:tc>
+          <w:tcPr/>
+          <w:p>
+            <w:pPr>
+              <w:pStyle w:val="Compact"/>
+              <w:jc w:val="left"/>
+            </w:pPr>
+            <w:r>
+              <w:rPr>
+                <w:rStyle w:val="VerbatimChar"/>
+              </w:rPr>
+              <w:t xml:space="preserve">qg-{regabbr}-{family}</w:t>
+            </w:r>
+          </w:p>
+        </w:tc>
+      </w:tr>
+      <w:tr>
+        <w:tc>
+          <w:tcPr/>
+          <w:p>
+            <w:pPr>
+              <w:pStyle w:val="Compact"/>
+              <w:jc w:val="left"/>
+            </w:pPr>
+            <w:r>
+              <w:t xml:space="preserve">B–D</w:t>
+            </w:r>
+          </w:p>
+        </w:tc>
+        <w:tc>
+          <w:tcPr/>
+          <w:p>
+            <w:pPr>
+              <w:pStyle w:val="Compact"/>
+              <w:jc w:val="left"/>
+            </w:pPr>
+            <w:r>
+              <w:t xml:space="preserve">Region, Geography, Quota Family</w:t>
+            </w:r>
+          </w:p>
+        </w:tc>
+        <w:tc>
+          <w:tcPr/>
+          <w:p>
+            <w:pPr>
+              <w:pStyle w:val="Compact"/>
+              <w:jc w:val="left"/>
+            </w:pPr>
+            <w:r>
+              <w:t xml:space="preserve">Grain keys</w:t>
+            </w:r>
+          </w:p>
+        </w:tc>
+      </w:tr>
+      <w:tr>
+        <w:tc>
+          <w:tcPr/>
+          <w:p>
+            <w:pPr>
+              <w:pStyle w:val="Compact"/>
+              <w:jc w:val="left"/>
+            </w:pPr>
+            <w:r>
+              <w:t xml:space="preserve">E</w:t>
+            </w:r>
+          </w:p>
+        </w:tc>
+        <w:tc>
+          <w:tcPr/>
+          <w:p>
+            <w:pPr>
+              <w:pStyle w:val="Compact"/>
+              <w:jc w:val="left"/>
+            </w:pPr>
+            <w:r>
+              <w:t xml:space="preserve">Group Limit (pooled)</w:t>
+            </w:r>
+          </w:p>
+        </w:tc>
+        <w:tc>
+          <w:tcPr/>
+          <w:p>
+            <w:pPr>
+              <w:pStyle w:val="Compact"/>
+              <w:jc w:val="left"/>
+            </w:pPr>
+            <w:r>
+              <w:t xml:space="preserve">One pooled limit per region+family spanning</w:t>
+            </w:r>
+            <w:r>
+              <w:t xml:space="preserve"> </w:t>
+            </w:r>
+            <w:r>
+              <w:rPr>
+                <w:bCs/>
+                <w:b/>
+              </w:rPr>
+              <w:t xml:space="preserve">Prod + NonProd + DR</w:t>
+            </w:r>
+            <w:r>
+              <w:t xml:space="preserve"> </w:t>
+            </w:r>
+            <w:r>
+              <w:t xml:space="preserve">(per ruling QUA-004: one quota group across all environments)</w:t>
+            </w:r>
+          </w:p>
+        </w:tc>
+      </w:tr>
+      <w:tr>
+        <w:tc>
+          <w:tcPr/>
+          <w:p>
+            <w:pPr>
+              <w:pStyle w:val="Compact"/>
+              <w:jc w:val="left"/>
+            </w:pPr>
+            <w:r>
+              <w:t xml:space="preserve">F</w:t>
+            </w:r>
+          </w:p>
+        </w:tc>
+        <w:tc>
+          <w:tcPr/>
+          <w:p>
+            <w:pPr>
+              <w:pStyle w:val="Compact"/>
+              <w:jc w:val="left"/>
+            </w:pPr>
+            <w:r>
+              <w:t xml:space="preserve">Group Used (all envs)</w:t>
+            </w:r>
+          </w:p>
+        </w:tc>
+        <w:tc>
+          <w:tcPr/>
+          <w:p>
+            <w:pPr>
+              <w:pStyle w:val="Compact"/>
+              <w:jc w:val="left"/>
+            </w:pPr>
+            <w:r>
+              <w:rPr>
+                <w:rStyle w:val="VerbatimChar"/>
+              </w:rPr>
+              <w:t xml:space="preserve">=SUMIFS(Capacity_By_SKU!$H:$H, …region, …family)</w:t>
+            </w:r>
+            <w:r>
+              <w:t xml:space="preserve"> </w:t>
+            </w:r>
+            <w:r>
+              <w:t xml:space="preserve">— sums allocation across</w:t>
+            </w:r>
+            <w:r>
+              <w:t xml:space="preserve"> </w:t>
+            </w:r>
+            <w:r>
+              <w:rPr>
+                <w:bCs/>
+                <w:b/>
+              </w:rPr>
+              <w:t xml:space="preserve">every</w:t>
+            </w:r>
+            <w:r>
+              <w:t xml:space="preserve"> </w:t>
+            </w:r>
+            <w:r>
+              <w:t xml:space="preserve">environment for that family</w:t>
+            </w:r>
+          </w:p>
+        </w:tc>
+      </w:tr>
+      <w:tr>
+        <w:tc>
+          <w:tcPr/>
+          <w:p>
+            <w:pPr>
+              <w:pStyle w:val="Compact"/>
+              <w:jc w:val="left"/>
+            </w:pPr>
+            <w:r>
+              <w:t xml:space="preserve">G</w:t>
+            </w:r>
+          </w:p>
+        </w:tc>
+        <w:tc>
+          <w:tcPr/>
+          <w:p>
+            <w:pPr>
+              <w:pStyle w:val="Compact"/>
+              <w:jc w:val="left"/>
+            </w:pPr>
+            <w:r>
+              <w:t xml:space="preserve">Group Available</w:t>
+            </w:r>
+          </w:p>
+        </w:tc>
+        <w:tc>
+          <w:tcPr/>
+          <w:p>
+            <w:pPr>
+              <w:pStyle w:val="Compact"/>
+              <w:jc w:val="left"/>
+            </w:pPr>
+            <w:r>
+              <w:rPr>
+                <w:rStyle w:val="VerbatimChar"/>
+              </w:rPr>
+              <w:t xml:space="preserve">=E−F</w:t>
+            </w:r>
+          </w:p>
+        </w:tc>
+      </w:tr>
+      <w:tr>
+        <w:tc>
+          <w:tcPr/>
+          <w:p>
+            <w:pPr>
+              <w:pStyle w:val="Compact"/>
+              <w:jc w:val="left"/>
+            </w:pPr>
+            <w:r>
+              <w:t xml:space="preserve">H</w:t>
+            </w:r>
+          </w:p>
+        </w:tc>
+        <w:tc>
+          <w:tcPr/>
+          <w:p>
+            <w:pPr>
+              <w:pStyle w:val="Compact"/>
+              <w:jc w:val="left"/>
+            </w:pPr>
+            <w:r>
+              <w:t xml:space="preserve">Hoarded Contrib</w:t>
+            </w:r>
+          </w:p>
+        </w:tc>
+        <w:tc>
+          <w:tcPr/>
+          <w:p>
+            <w:pPr>
+              <w:pStyle w:val="Compact"/>
+              <w:jc w:val="left"/>
+            </w:pPr>
+            <w:r>
+              <w:t xml:space="preserve">Portion hoarded into the shared pool for on-demand distribution (QUA-003), modelled at 10% of limit</w:t>
+            </w:r>
+          </w:p>
+        </w:tc>
+      </w:tr>
+      <w:tr>
+        <w:tc>
+          <w:tcPr/>
+          <w:p>
+            <w:pPr>
+              <w:pStyle w:val="Compact"/>
+              <w:jc w:val="left"/>
+            </w:pPr>
+            <w:r>
+              <w:t xml:space="preserve">I</w:t>
+            </w:r>
+          </w:p>
+        </w:tc>
+        <w:tc>
+          <w:tcPr/>
+          <w:p>
+            <w:pPr>
+              <w:pStyle w:val="Compact"/>
+              <w:jc w:val="left"/>
+            </w:pPr>
+            <w:r>
+              <w:t xml:space="preserve">Pending Increase</w:t>
+            </w:r>
+          </w:p>
+        </w:tc>
+        <w:tc>
+          <w:tcPr/>
+          <w:p>
+            <w:pPr>
+              <w:pStyle w:val="Compact"/>
+              <w:jc w:val="left"/>
+            </w:pPr>
+            <w:r>
+              <w:t xml:space="preserve">Placeholder for in-flight Microsoft quota increase requests</w:t>
+            </w:r>
+          </w:p>
+        </w:tc>
+      </w:tr>
+    </w:tbl>
+    <w:p>
+      <w:pPr>
+        <w:pStyle w:val="BlockText"/>
+      </w:pPr>
+      <w:r>
+        <w:rPr>
+          <w:bCs/>
+          <w:b/>
+        </w:rPr>
+        <w:t xml:space="preserve">No circular reference.</w:t>
+      </w:r>
+      <w:r>
+        <w:t xml:space="preserve"> </w:t>
+      </w:r>
+      <w:r>
+        <w:rPr>
+          <w:rStyle w:val="VerbatimChar"/>
+        </w:rPr>
+        <w:t xml:space="preserve">Capacity_By_SKU!L</w:t>
+      </w:r>
+      <w:r>
+        <w:t xml:space="preserve"> </w:t>
+      </w:r>
+      <w:r>
+        <w:t xml:space="preserve">→</w:t>
+      </w:r>
+      <w:r>
+        <w:t xml:space="preserve"> </w:t>
+      </w:r>
+      <w:r>
+        <w:rPr>
+          <w:rStyle w:val="VerbatimChar"/>
+        </w:rPr>
+        <w:t xml:space="preserve">Quota_Groups!G</w:t>
+      </w:r>
+      <w:r>
+        <w:t xml:space="preserve"> </w:t>
+      </w:r>
+      <w:r>
+        <w:t xml:space="preserve">→</w:t>
+      </w:r>
+      <w:r>
+        <w:t xml:space="preserve"> </w:t>
+      </w:r>
+      <w:r>
+        <w:rPr>
+          <w:rStyle w:val="VerbatimChar"/>
+        </w:rPr>
+        <w:t xml:space="preserve">Quota_Groups!F</w:t>
+      </w:r>
+      <w:r>
+        <w:t xml:space="preserve"> </w:t>
+      </w:r>
+      <w:r>
+        <w:t xml:space="preserve">→</w:t>
+      </w:r>
+      <w:r>
+        <w:t xml:space="preserve"> </w:t>
+      </w:r>
+      <w:r>
+        <w:rPr>
+          <w:rStyle w:val="VerbatimChar"/>
+        </w:rPr>
+        <w:t xml:space="preserve">Capacity_By_SKU!H</w:t>
+      </w:r>
+      <w:r>
+        <w:t xml:space="preserve"> </w:t>
+      </w:r>
+      <w:r>
+        <w:t xml:space="preserve">(a static seeded value). The chain terminates on a constant, so the workbook recalculates cleanly (verified with a headless recalc: 0 formula errors).</w:t>
+      </w:r>
+    </w:p>
+    <w:bookmarkEnd w:id="114"/>
+    <w:bookmarkStart w:id="115" w:name="rulings-baked-into-phase-1"/>
+    <w:p>
+      <w:pPr>
+        <w:pStyle w:val="Heading3"/>
+      </w:pPr>
+      <w:r>
+        <w:t xml:space="preserve">11.5 Rulings baked into Phase 1</w:t>
+      </w:r>
+    </w:p>
+    <w:p>
+      <w:pPr>
+        <w:pStyle w:val="FirstParagraph"/>
+      </w:pPr>
+      <w:r>
+        <w:t xml:space="preserve">These reflect the design decisions confirmed for this build:</w:t>
+      </w:r>
+    </w:p>
+    <w:p>
+      <w:pPr>
+        <w:numPr>
+          <w:ilvl w:val="0"/>
+          <w:numId w:val="1008"/>
+        </w:numPr>
+        <w:pStyle w:val="Compact"/>
+      </w:pPr>
+      <w:r>
+        <w:rPr>
+          <w:bCs/>
+          <w:b/>
+        </w:rPr>
+        <w:t xml:space="preserve">One pooled quota group across Prod + NonProd + DR</w:t>
+      </w:r>
+      <w:r>
+        <w:t xml:space="preserve"> </w:t>
+      </w:r>
+      <w:r>
+        <w:t xml:space="preserve">(QUA-004).</w:t>
+      </w:r>
+      <w:r>
+        <w:t xml:space="preserve"> </w:t>
+      </w:r>
+      <w:r>
+        <w:rPr>
+          <w:rStyle w:val="VerbatimChar"/>
+        </w:rPr>
+        <w:t xml:space="preserve">Group Used</w:t>
+      </w:r>
+      <w:r>
+        <w:t xml:space="preserve"> </w:t>
+      </w:r>
+      <w:r>
+        <w:t xml:space="preserve">sums allocation across all three environments.</w:t>
+      </w:r>
+    </w:p>
+    <w:p>
+      <w:pPr>
+        <w:numPr>
+          <w:ilvl w:val="0"/>
+          <w:numId w:val="1008"/>
+        </w:numPr>
+        <w:pStyle w:val="Compact"/>
+      </w:pPr>
+      <w:r>
+        <w:rPr>
+          <w:bCs/>
+          <w:b/>
+        </w:rPr>
+        <w:t xml:space="preserve">Hard environment separation applies to</w:t>
+      </w:r>
+      <w:r>
+        <w:rPr>
+          <w:bCs/>
+          <w:b/>
+        </w:rPr>
+        <w:t xml:space="preserve"> </w:t>
+      </w:r>
+      <w:r>
+        <w:rPr>
+          <w:iCs/>
+          <w:i/>
+          <w:bCs/>
+          <w:b/>
+        </w:rPr>
+        <w:t xml:space="preserve">capacity reservations only</w:t>
+      </w:r>
+      <w:r>
+        <w:t xml:space="preserve"> </w:t>
+      </w:r>
+      <w:r>
+        <w:t xml:space="preserve">(ENV-003). Capacity and quota are separate planes; quota is pooled, capacity is per-environment.</w:t>
+      </w:r>
+    </w:p>
+    <w:p>
+      <w:pPr>
+        <w:numPr>
+          <w:ilvl w:val="0"/>
+          <w:numId w:val="1008"/>
+        </w:numPr>
+        <w:pStyle w:val="Compact"/>
+      </w:pPr>
+      <w:r>
+        <w:rPr>
+          <w:bCs/>
+          <w:b/>
+        </w:rPr>
+        <w:t xml:space="preserve">Quota is hoarded into a single pool and distributed on demand</w:t>
+      </w:r>
+      <w:r>
+        <w:t xml:space="preserve"> </w:t>
+      </w:r>
+      <w:r>
+        <w:t xml:space="preserve">(QUA-003) — represented by the</w:t>
+      </w:r>
+      <w:r>
+        <w:t xml:space="preserve"> </w:t>
+      </w:r>
+      <w:r>
+        <w:rPr>
+          <w:rStyle w:val="VerbatimChar"/>
+        </w:rPr>
+        <w:t xml:space="preserve">Hoarded Contrib</w:t>
+      </w:r>
+      <w:r>
+        <w:t xml:space="preserve"> </w:t>
+      </w:r>
+      <w:r>
+        <w:t xml:space="preserve">column.</w:t>
+      </w:r>
+    </w:p>
+    <w:p>
+      <w:pPr>
+        <w:numPr>
+          <w:ilvl w:val="0"/>
+          <w:numId w:val="1008"/>
+        </w:numPr>
+        <w:pStyle w:val="Compact"/>
+      </w:pPr>
+      <w:r>
+        <w:t xml:space="preserve">Capacity is broken out</w:t>
+      </w:r>
+      <w:r>
+        <w:t xml:space="preserve"> </w:t>
+      </w:r>
+      <w:r>
+        <w:rPr>
+          <w:bCs/>
+          <w:b/>
+        </w:rPr>
+        <w:t xml:space="preserve">by SKU</w:t>
+      </w:r>
+      <w:r>
+        <w:t xml:space="preserve">, quota</w:t>
+      </w:r>
+      <w:r>
+        <w:t xml:space="preserve"> </w:t>
+      </w:r>
+      <w:r>
+        <w:rPr>
+          <w:bCs/>
+          <w:b/>
+        </w:rPr>
+        <w:t xml:space="preserve">by family</w:t>
+      </w:r>
+      <w:r>
+        <w:t xml:space="preserve"> </w:t>
+      </w:r>
+      <w:r>
+        <w:t xml:space="preserve">— the MIN join reconciles them.</w:t>
+      </w:r>
+    </w:p>
+    <w:bookmarkEnd w:id="115"/>
+    <w:bookmarkStart w:id="116" w:name="how-to-read-a-row-worked-example"/>
+    <w:p>
+      <w:pPr>
+        <w:pStyle w:val="Heading3"/>
+      </w:pPr>
+      <w:r>
+        <w:t xml:space="preserve">11.6 How to read a row (worked example)</w:t>
+      </w:r>
+    </w:p>
+    <w:p>
+      <w:pPr>
+        <w:numPr>
+          <w:ilvl w:val="0"/>
+          <w:numId w:val="1009"/>
+        </w:numPr>
+        <w:pStyle w:val="Compact"/>
+      </w:pPr>
+      <w:r>
+        <w:rPr>
+          <w:bCs/>
+          <w:b/>
+        </w:rPr>
+        <w:t xml:space="preserve">Central US · Prod · Standard_E32ads_v5</w:t>
+      </w:r>
+      <w:r>
+        <w:t xml:space="preserve"> </w:t>
+      </w:r>
+      <w:r>
+        <w:t xml:space="preserve">→ Reserved-Free 8, Family Quota-Avail 548 →</w:t>
+      </w:r>
+      <w:r>
+        <w:t xml:space="preserve"> </w:t>
+      </w:r>
+      <w:r>
+        <w:rPr>
+          <w:bCs/>
+          <w:b/>
+        </w:rPr>
+        <w:t xml:space="preserve">GROUP AVAIL = MIN(8, 548) = 8</w:t>
+      </w:r>
+      <w:r>
+        <w:t xml:space="preserve">, Binding Constraint</w:t>
+      </w:r>
+      <w:r>
+        <w:t xml:space="preserve"> </w:t>
+      </w:r>
+      <w:r>
+        <w:rPr>
+          <w:bCs/>
+          <w:b/>
+        </w:rPr>
+        <w:t xml:space="preserve">CAPACITY</w:t>
+      </w:r>
+      <w:r>
+        <w:t xml:space="preserve">, Readiness</w:t>
+      </w:r>
+      <w:r>
+        <w:t xml:space="preserve"> </w:t>
+      </w:r>
+      <w:r>
+        <w:rPr>
+          <w:bCs/>
+          <w:b/>
+        </w:rPr>
+        <w:t xml:space="preserve">READY</w:t>
+      </w:r>
+      <w:r>
+        <w:t xml:space="preserve">. Here quota is plentiful; the buffer headroom is the limiter.</w:t>
+      </w:r>
+    </w:p>
+    <w:p>
+      <w:pPr>
+        <w:numPr>
+          <w:ilvl w:val="0"/>
+          <w:numId w:val="1009"/>
+        </w:numPr>
+        <w:pStyle w:val="Compact"/>
+      </w:pPr>
+      <w:r>
+        <w:rPr>
+          <w:bCs/>
+          <w:b/>
+        </w:rPr>
+        <w:t xml:space="preserve">West US 3 · Prod · Standard_E32ads_v5</w:t>
+      </w:r>
+      <w:r>
+        <w:t xml:space="preserve"> </w:t>
+      </w:r>
+      <w:r>
+        <w:t xml:space="preserve">→ this region has ~0 observed allocation in the source data, so its quota group limit is 0 → Family Quota-Avail 0 →</w:t>
+      </w:r>
+      <w:r>
+        <w:t xml:space="preserve"> </w:t>
+      </w:r>
+      <w:r>
+        <w:rPr>
+          <w:bCs/>
+          <w:b/>
+        </w:rPr>
+        <w:t xml:space="preserve">GROUP AVAIL = MIN(8, 0) = 0</w:t>
+      </w:r>
+      <w:r>
+        <w:t xml:space="preserve">, Binding Constraint</w:t>
+      </w:r>
+      <w:r>
+        <w:t xml:space="preserve"> </w:t>
+      </w:r>
+      <w:r>
+        <w:rPr>
+          <w:bCs/>
+          <w:b/>
+        </w:rPr>
+        <w:t xml:space="preserve">QUOTA</w:t>
+      </w:r>
+      <w:r>
+        <w:t xml:space="preserve">, Readiness</w:t>
+      </w:r>
+      <w:r>
+        <w:t xml:space="preserve"> </w:t>
+      </w:r>
+      <w:r>
+        <w:rPr>
+          <w:bCs/>
+          <w:b/>
+        </w:rPr>
+        <w:t xml:space="preserve">QUOTA_DEFICIT</w:t>
+      </w:r>
+      <w:r>
+        <w:t xml:space="preserve">. This is the correct signal for a greenfield region that is reserved but has no quota provisioned yet.</w:t>
+      </w:r>
+    </w:p>
+    <w:bookmarkEnd w:id="116"/>
+    <w:bookmarkStart w:id="117" w:name="what-phase-1-does-not-do-deferred"/>
+    <w:p>
+      <w:pPr>
+        <w:pStyle w:val="Heading3"/>
+      </w:pPr>
+      <w:r>
+        <w:t xml:space="preserve">11.7 What Phase 1 does</w:t>
+      </w:r>
+      <w:r>
+        <w:t xml:space="preserve"> </w:t>
+      </w:r>
+      <w:r>
+        <w:rPr>
+          <w:iCs/>
+          <w:i/>
+        </w:rPr>
+        <w:t xml:space="preserve">not</w:t>
+      </w:r>
+      <w:r>
+        <w:t xml:space="preserve"> </w:t>
+      </w:r>
+      <w:r>
+        <w:t xml:space="preserve">do (deferred)</w:t>
+      </w:r>
+    </w:p>
+    <w:p>
+      <w:pPr>
+        <w:numPr>
+          <w:ilvl w:val="0"/>
+          <w:numId w:val="1010"/>
+        </w:numPr>
+        <w:pStyle w:val="Compact"/>
+      </w:pPr>
+      <w:r>
+        <w:rPr>
+          <w:bCs/>
+          <w:b/>
+        </w:rPr>
+        <w:t xml:space="preserve">Phase 2</w:t>
+      </w:r>
+      <w:r>
+        <w:t xml:space="preserve"> </w:t>
+      </w:r>
+      <w:r>
+        <w:t xml:space="preserve">— feed per-SKU</w:t>
+      </w:r>
+      <w:r>
+        <w:t xml:space="preserve"> </w:t>
+      </w:r>
+      <w:r>
+        <w:rPr>
+          <w:rStyle w:val="VerbatimChar"/>
+        </w:rPr>
+        <w:t xml:space="preserve">GROUP AVAIL</w:t>
+      </w:r>
+      <w:r>
+        <w:t xml:space="preserve"> </w:t>
+      </w:r>
+      <w:r>
+        <w:t xml:space="preserve">and RDY-002 readiness into the Prod/CVAL/DR scoring engine (the α term at SKU grain).</w:t>
+      </w:r>
+    </w:p>
+    <w:p>
+      <w:pPr>
+        <w:numPr>
+          <w:ilvl w:val="0"/>
+          <w:numId w:val="1010"/>
+        </w:numPr>
+        <w:pStyle w:val="Compact"/>
+      </w:pPr>
+      <w:r>
+        <w:rPr>
+          <w:bCs/>
+          <w:b/>
+        </w:rPr>
+        <w:t xml:space="preserve">Phase 3</w:t>
+      </w:r>
+      <w:r>
+        <w:t xml:space="preserve"> </w:t>
+      </w:r>
+      <w:r>
+        <w:t xml:space="preserve">— the post-freeze</w:t>
+      </w:r>
+      <w:r>
+        <w:t xml:space="preserve"> </w:t>
+      </w:r>
+      <w:r>
+        <w:rPr>
+          <w:bCs/>
+          <w:b/>
+        </w:rPr>
+        <w:t xml:space="preserve">logical lock</w:t>
+      </w:r>
+      <w:r>
+        <w:t xml:space="preserve">: an</w:t>
+      </w:r>
+      <w:r>
+        <w:t xml:space="preserve"> </w:t>
+      </w:r>
+      <w:r>
+        <w:rPr>
+          <w:rStyle w:val="VerbatimChar"/>
+        </w:rPr>
+        <w:t xml:space="preserve">Allocation_Ledger</w:t>
+      </w:r>
+      <w:r>
+        <w:t xml:space="preserve"> </w:t>
+      </w:r>
+      <w:r>
+        <w:t xml:space="preserve">that logically locks the environment to a region on freeze, then reconciles to actual Azure values on a later cycle (logical lock first, reconciliation second — per ruling).</w:t>
+      </w:r>
+    </w:p>
+    <w:p>
+      <w:pPr>
+        <w:numPr>
+          <w:ilvl w:val="0"/>
+          <w:numId w:val="1010"/>
+        </w:numPr>
+        <w:pStyle w:val="Compact"/>
+      </w:pPr>
+      <w:r>
+        <w:rPr>
+          <w:bCs/>
+          <w:b/>
+        </w:rPr>
+        <w:t xml:space="preserve">Per-AZ CRGs</w:t>
+      </w:r>
+      <w:r>
+        <w:t xml:space="preserve"> </w:t>
+      </w:r>
+      <w:r>
+        <w:t xml:space="preserve">(</w:t>
+      </w:r>
+      <w:r>
+        <w:rPr>
+          <w:rStyle w:val="VerbatimChar"/>
+        </w:rPr>
+        <w:t xml:space="preserve">crg-pr-eus2-az1</w:t>
+      </w:r>
+      <w:r>
+        <w:t xml:space="preserve">) — Phase 1 uses regional-scope CRG naming only.</w:t>
+      </w:r>
+    </w:p>
+    <w:p>
+      <w:pPr>
+        <w:numPr>
+          <w:ilvl w:val="0"/>
+          <w:numId w:val="1010"/>
+        </w:numPr>
+        <w:pStyle w:val="Compact"/>
+      </w:pPr>
+      <w:r>
+        <w:rPr>
+          <w:bCs/>
+          <w:b/>
+        </w:rPr>
+        <w:t xml:space="preserve">SKU→family authoritative source</w:t>
+      </w:r>
+      <w:r>
+        <w:t xml:space="preserve"> </w:t>
+      </w:r>
+      <w:r>
+        <w:t xml:space="preserve">— Phase 1 derives families from SKU naming; a canonical Azure mapping would replace</w:t>
+      </w:r>
+      <w:r>
+        <w:t xml:space="preserve"> </w:t>
+      </w:r>
+      <w:r>
+        <w:rPr>
+          <w:rStyle w:val="VerbatimChar"/>
+        </w:rPr>
+        <w:t xml:space="preserve">SKU_Family_Map</w:t>
+      </w:r>
+      <w:r>
+        <w:t xml:space="preserve"> </w:t>
+      </w:r>
+      <w:r>
+        <w:t xml:space="preserve">later.</w:t>
+      </w:r>
+    </w:p>
+    <w:p>
+      <w:r>
+        <w:pict>
+          <v:rect style="width:0;height:1.5pt" o:hralign="center" o:hrstd="t" o:hr="t"/>
+        </w:pict>
+      </w:r>
+    </w:p>
+    <w:p>
+      <w:pPr>
+        <w:pStyle w:val="FirstParagraph"/>
+      </w:pPr>
+      <w:r>
+        <w:rPr>
+          <w:iCs/>
+          <w:i/>
+        </w:rPr>
+        <w:t xml:space="preserve">End of User Guide — baseline v2.4 · Phase 1 SKU-grain sheets added 24 Sep 2026 · Last updated: 24 Sep 2026</w:t>
+      </w:r>
+    </w:p>
+    <w:bookmarkEnd w:id="117"/>
+    <w:bookmarkEnd w:id="118"/>
+    <w:bookmarkEnd w:id="119"/>
     <w:sectPr/>
   </w:body>
 </w:document>
@@ -16069,6 +18281,45 @@
     <w:abstractNumId w:val="991"/>
   </w:num>
   <w:num w:numId="1006">
+    <w:abstractNumId w:val="991"/>
+  </w:num>
+  <w:num w:numId="1007">
+    <w:abstractNumId w:val="991"/>
+  </w:num>
+  <w:num w:numId="1008">
+    <w:abstractNumId w:val="99411"/>
+    <w:lvlOverride w:ilvl="0">
+      <w:startOverride w:val="1"/>
+    </w:lvlOverride>
+    <w:lvlOverride w:ilvl="1">
+      <w:startOverride w:val="1"/>
+    </w:lvlOverride>
+    <w:lvlOverride w:ilvl="2">
+      <w:startOverride w:val="1"/>
+    </w:lvlOverride>
+    <w:lvlOverride w:ilvl="3">
+      <w:startOverride w:val="1"/>
+    </w:lvlOverride>
+    <w:lvlOverride w:ilvl="4">
+      <w:startOverride w:val="1"/>
+    </w:lvlOverride>
+    <w:lvlOverride w:ilvl="5">
+      <w:startOverride w:val="1"/>
+    </w:lvlOverride>
+    <w:lvlOverride w:ilvl="6">
+      <w:startOverride w:val="1"/>
+    </w:lvlOverride>
+    <w:lvlOverride w:ilvl="7">
+      <w:startOverride w:val="1"/>
+    </w:lvlOverride>
+    <w:lvlOverride w:ilvl="8">
+      <w:startOverride w:val="1"/>
+    </w:lvlOverride>
+  </w:num>
+  <w:num w:numId="1009">
+    <w:abstractNumId w:val="991"/>
+  </w:num>
+  <w:num w:numId="1010">
     <w:abstractNumId w:val="991"/>
   </w:num>
 </w:numbering>

</xml_diff>